<commit_message>
Replace old chart with grafik_projeksiyon.png in report
</commit_message>
<xml_diff>
--- a/Trafik Kazaları Simülasyon Raporu.docx
+++ b/Trafik Kazaları Simülasyon Raporu.docx
@@ -20386,40 +20386,31 @@
       </w:pPr>
       <w:r>
         <w:drawing>
-          <wp:inline wp14:editId="763E0C4E" wp14:anchorId="37EDA12E">
-            <wp:extent cx="5772150" cy="3588017"/>
-            <wp:effectExtent l="0" t="0" r="0" b="0"/>
-            <wp:docPr id="1559786212" name="drawing"/>
+          <wp:inline>
+            <wp:extent cx="5486400" cy="2743200"/>
+            <wp:docPr id="1" name="Picture 1"/>
             <wp:cNvGraphicFramePr>
               <a:graphicFrameLocks noChangeAspect="1"/>
             </wp:cNvGraphicFramePr>
             <a:graphic>
-              <a:graphicData xmlns:a="http://schemas.openxmlformats.org/drawingml/2006/main" uri="http://schemas.openxmlformats.org/drawingml/2006/picture">
-                <pic:pic xmlns:pic="http://schemas.openxmlformats.org/drawingml/2006/picture">
+              <a:graphicData uri="http://schemas.openxmlformats.org/drawingml/2006/picture">
+                <pic:pic>
                   <pic:nvPicPr>
-                    <pic:cNvPr id="1559786212" name="Picture 1559786212"/>
+                    <pic:cNvPr id="0" name="grafik_projeksiyon.png"/>
                     <pic:cNvPicPr/>
                   </pic:nvPicPr>
                   <pic:blipFill>
-                    <a:blip xmlns:r="http://schemas.openxmlformats.org/officeDocument/2006/relationships" r:embed="rId1662118621">
-                      <a:extLst>
-                        <a:ext uri="{28A0092B-C50C-407E-A947-70E740481C1C}">
-                          <a14:useLocalDpi xmlns:a14="http://schemas.microsoft.com/office/drawing/2010/main"/>
-                        </a:ext>
-                      </a:extLst>
-                    </a:blip>
+                    <a:blip r:embed="rId3"/>
                     <a:stretch>
                       <a:fillRect/>
                     </a:stretch>
                   </pic:blipFill>
                   <pic:spPr>
-                    <a:xfrm rot="0">
+                    <a:xfrm>
                       <a:off x="0" y="0"/>
-                      <a:ext cx="5772150" cy="3588017"/>
+                      <a:ext cx="5486400" cy="2743200"/>
                     </a:xfrm>
-                    <a:prstGeom prst="rect">
-                      <a:avLst/>
-                    </a:prstGeom>
+                    <a:prstGeom prst="rect"/>
                   </pic:spPr>
                 </pic:pic>
               </a:graphicData>

</xml_diff>